<commit_message>
made some changes in code and report
</commit_message>
<xml_diff>
--- a/Assignment1/Problem2.1/report.docx
+++ b/Assignment1/Problem2.1/report.docx
@@ -42,15 +42,7 @@
           <w:sz w:val="32"/>
           <w:szCs w:val="32"/>
         </w:rPr>
-        <w:t>Problem Definition &amp; Methodology</w:t>
-      </w:r>
-      <w:r>
-        <w:rPr>
-          <w:rFonts w:cstheme="minorHAnsi"/>
-          <w:sz w:val="32"/>
-          <w:szCs w:val="32"/>
-        </w:rPr>
-        <w:t>:</w:t>
+        <w:t>Problem Definition &amp; Methodology:</w:t>
       </w:r>
     </w:p>
     <w:p>
@@ -99,25 +91,7 @@
           <w:sz w:val="24"/>
           <w:szCs w:val="24"/>
         </w:rPr>
-        <w:t xml:space="preserve"> a Fully Connected Neural Network (FCNN), on MNIST dataset using </w:t>
-      </w:r>
-      <w:proofErr w:type="spellStart"/>
-      <w:r>
-        <w:rPr>
-          <w:rFonts w:cstheme="minorHAnsi"/>
-          <w:sz w:val="24"/>
-          <w:szCs w:val="24"/>
-        </w:rPr>
-        <w:t>pytorch</w:t>
-      </w:r>
-      <w:proofErr w:type="spellEnd"/>
-      <w:r>
-        <w:rPr>
-          <w:rFonts w:cstheme="minorHAnsi"/>
-          <w:sz w:val="24"/>
-          <w:szCs w:val="24"/>
-        </w:rPr>
-        <w:t xml:space="preserve"> and </w:t>
+        <w:t xml:space="preserve"> a Fully Connected Neural Network (FCNN), on MNIST dataset using pytorch and </w:t>
       </w:r>
       <w:r>
         <w:rPr>
@@ -356,25 +330,7 @@
           <w:sz w:val="24"/>
           <w:szCs w:val="24"/>
         </w:rPr>
-        <w:t xml:space="preserve">Two hidden layers of size 128 each with </w:t>
-      </w:r>
-      <w:proofErr w:type="spellStart"/>
-      <w:r>
-        <w:rPr>
-          <w:rFonts w:cstheme="minorHAnsi"/>
-          <w:sz w:val="24"/>
-          <w:szCs w:val="24"/>
-        </w:rPr>
-        <w:t>relu</w:t>
-      </w:r>
-      <w:proofErr w:type="spellEnd"/>
-      <w:r>
-        <w:rPr>
-          <w:rFonts w:cstheme="minorHAnsi"/>
-          <w:sz w:val="24"/>
-          <w:szCs w:val="24"/>
-        </w:rPr>
-        <w:t xml:space="preserve"> activations.</w:t>
+        <w:t>Two hidden layers of size 128 each with relu activations.</w:t>
       </w:r>
     </w:p>
     <w:p>
@@ -535,15 +491,7 @@
           <w:sz w:val="24"/>
           <w:szCs w:val="24"/>
         </w:rPr>
-        <w:t xml:space="preserve">the loss decreased from </w:t>
-      </w:r>
-      <w:r>
-        <w:rPr>
-          <w:rFonts w:cstheme="minorHAnsi"/>
-          <w:sz w:val="24"/>
-          <w:szCs w:val="24"/>
-        </w:rPr>
-        <w:t xml:space="preserve">0.3809 in the first epoch to 0.0061 in the final epoch. </w:t>
+        <w:t xml:space="preserve">the loss decreased from 0.3809 in the first epoch to 0.0061 in the final epoch. </w:t>
       </w:r>
     </w:p>
     <w:p>
@@ -586,13 +534,257 @@
           <w:sz w:val="32"/>
           <w:szCs w:val="32"/>
         </w:rPr>
-        <w:t>Weight Visualization</w:t>
-      </w:r>
-      <w:r>
-        <w:rPr>
-          <w:rFonts w:cstheme="minorHAnsi"/>
-          <w:sz w:val="32"/>
-          <w:szCs w:val="32"/>
+        <w:t>Weight Visualization:</w:t>
+      </w:r>
+    </w:p>
+    <w:p>
+      <w:pPr>
+        <w:rPr>
+          <w:rFonts w:cstheme="minorHAnsi"/>
+          <w:sz w:val="24"/>
+          <w:szCs w:val="24"/>
+        </w:rPr>
+      </w:pPr>
+      <w:r>
+        <w:rPr>
+          <w:rFonts w:cstheme="minorHAnsi"/>
+          <w:sz w:val="24"/>
+          <w:szCs w:val="24"/>
+        </w:rPr>
+        <w:t>After</w:t>
+      </w:r>
+      <w:r>
+        <w:rPr>
+          <w:rFonts w:cstheme="minorHAnsi"/>
+          <w:sz w:val="24"/>
+          <w:szCs w:val="24"/>
+        </w:rPr>
+        <w:t xml:space="preserve"> the model </w:t>
+      </w:r>
+      <w:r>
+        <w:rPr>
+          <w:rFonts w:cstheme="minorHAnsi"/>
+          <w:sz w:val="24"/>
+          <w:szCs w:val="24"/>
+        </w:rPr>
+        <w:t>wa</w:t>
+      </w:r>
+      <w:r>
+        <w:rPr>
+          <w:rFonts w:cstheme="minorHAnsi"/>
+          <w:sz w:val="24"/>
+          <w:szCs w:val="24"/>
+        </w:rPr>
+        <w:t xml:space="preserve">s trained, and weights of first hidden layer </w:t>
+      </w:r>
+      <w:r>
+        <w:rPr>
+          <w:rFonts w:cstheme="minorHAnsi"/>
+          <w:sz w:val="24"/>
+          <w:szCs w:val="24"/>
+        </w:rPr>
+        <w:t>were extracted, the weights were</w:t>
+      </w:r>
+      <w:r>
+        <w:rPr>
+          <w:rFonts w:cstheme="minorHAnsi"/>
+          <w:sz w:val="24"/>
+          <w:szCs w:val="24"/>
+        </w:rPr>
+        <w:t xml:space="preserve"> of dimension 128x784, i.e., </w:t>
+      </w:r>
+      <w:r>
+        <w:rPr>
+          <w:rFonts w:cstheme="minorHAnsi"/>
+          <w:sz w:val="24"/>
+          <w:szCs w:val="24"/>
+        </w:rPr>
+        <w:t>the first hidden layer</w:t>
+      </w:r>
+      <w:r>
+        <w:rPr>
+          <w:rFonts w:cstheme="minorHAnsi"/>
+          <w:sz w:val="24"/>
+          <w:szCs w:val="24"/>
+        </w:rPr>
+        <w:t xml:space="preserve"> contain</w:t>
+      </w:r>
+      <w:r>
+        <w:rPr>
+          <w:rFonts w:cstheme="minorHAnsi"/>
+          <w:sz w:val="24"/>
+          <w:szCs w:val="24"/>
+        </w:rPr>
+        <w:t>s</w:t>
+      </w:r>
+      <w:r>
+        <w:rPr>
+          <w:rFonts w:cstheme="minorHAnsi"/>
+          <w:sz w:val="24"/>
+          <w:szCs w:val="24"/>
+        </w:rPr>
+        <w:t xml:space="preserve"> 128 neurons, each neuron is connected to 784 </w:t>
+      </w:r>
+      <w:r>
+        <w:rPr>
+          <w:rFonts w:cstheme="minorHAnsi"/>
+          <w:sz w:val="24"/>
+          <w:szCs w:val="24"/>
+        </w:rPr>
+        <w:t>input pixels.</w:t>
+      </w:r>
+    </w:p>
+    <w:p>
+      <w:pPr>
+        <w:rPr>
+          <w:rFonts w:cstheme="minorHAnsi"/>
+          <w:sz w:val="24"/>
+          <w:szCs w:val="24"/>
+        </w:rPr>
+      </w:pPr>
+      <w:r>
+        <w:rPr>
+          <w:rFonts w:cstheme="minorHAnsi"/>
+          <w:sz w:val="24"/>
+          <w:szCs w:val="24"/>
+        </w:rPr>
+        <w:t xml:space="preserve"> </w:t>
+      </w:r>
+      <w:r>
+        <w:rPr>
+          <w:rFonts w:cstheme="minorHAnsi"/>
+          <w:sz w:val="24"/>
+          <w:szCs w:val="24"/>
+        </w:rPr>
+        <w:t>A</w:t>
+      </w:r>
+      <w:r>
+        <w:rPr>
+          <w:rFonts w:cstheme="minorHAnsi"/>
+          <w:sz w:val="24"/>
+          <w:szCs w:val="24"/>
+        </w:rPr>
+        <w:t xml:space="preserve">ccording to our task, we have to </w:t>
+      </w:r>
+      <w:r>
+        <w:rPr>
+          <w:rFonts w:cstheme="minorHAnsi"/>
+          <w:sz w:val="24"/>
+          <w:szCs w:val="24"/>
+        </w:rPr>
+        <w:t>select</w:t>
+      </w:r>
+      <w:r>
+        <w:rPr>
+          <w:rFonts w:cstheme="minorHAnsi"/>
+          <w:sz w:val="24"/>
+          <w:szCs w:val="24"/>
+        </w:rPr>
+        <w:t xml:space="preserve"> 10 different neurons, and then reshape them back into 28x28 grids, </w:t>
+      </w:r>
+      <w:r>
+        <w:rPr>
+          <w:rFonts w:cstheme="minorHAnsi"/>
+          <w:sz w:val="24"/>
+          <w:szCs w:val="24"/>
+        </w:rPr>
+        <w:t>and plot them as heatmap</w:t>
+      </w:r>
+      <w:r>
+        <w:rPr>
+          <w:rFonts w:cstheme="minorHAnsi"/>
+          <w:sz w:val="24"/>
+          <w:szCs w:val="24"/>
+        </w:rPr>
+        <w:t>s</w:t>
+      </w:r>
+      <w:r>
+        <w:rPr>
+          <w:rFonts w:cstheme="minorHAnsi"/>
+          <w:sz w:val="24"/>
+          <w:szCs w:val="24"/>
+        </w:rPr>
+        <w:t>.</w:t>
+      </w:r>
+    </w:p>
+    <w:p>
+      <w:pPr>
+        <w:rPr>
+          <w:rFonts w:cstheme="minorHAnsi"/>
+          <w:sz w:val="24"/>
+          <w:szCs w:val="24"/>
+        </w:rPr>
+      </w:pPr>
+      <w:r>
+        <w:rPr>
+          <w:rFonts w:cstheme="minorHAnsi"/>
+          <w:sz w:val="24"/>
+          <w:szCs w:val="24"/>
+        </w:rPr>
+        <w:t>Positive weights will indicate regions of the image that excite the neuron, while negative weights suppress activation.</w:t>
+      </w:r>
+    </w:p>
+    <w:p>
+      <w:pPr>
+        <w:rPr>
+          <w:rFonts w:cstheme="minorHAnsi"/>
+          <w:sz w:val="24"/>
+          <w:szCs w:val="24"/>
+        </w:rPr>
+      </w:pPr>
+      <w:r>
+        <w:rPr>
+          <w:rFonts w:cstheme="minorHAnsi"/>
+          <w:sz w:val="24"/>
+          <w:szCs w:val="24"/>
+        </w:rPr>
+        <w:t xml:space="preserve">Here are the heatmaps of </w:t>
+      </w:r>
+      <w:r>
+        <w:rPr>
+          <w:rFonts w:cstheme="minorHAnsi"/>
+          <w:sz w:val="24"/>
+          <w:szCs w:val="24"/>
+        </w:rPr>
+        <w:t>1</w:t>
+      </w:r>
+      <w:r>
+        <w:rPr>
+          <w:rFonts w:cstheme="minorHAnsi"/>
+          <w:sz w:val="24"/>
+          <w:szCs w:val="24"/>
+        </w:rPr>
+        <w:t>0 neurons</w:t>
+      </w:r>
+      <w:r>
+        <w:rPr>
+          <w:rFonts w:cstheme="minorHAnsi"/>
+          <w:sz w:val="24"/>
+          <w:szCs w:val="24"/>
+        </w:rPr>
+        <w:t xml:space="preserve"> (</w:t>
+      </w:r>
+      <w:r>
+        <w:rPr>
+          <w:rFonts w:cstheme="minorHAnsi"/>
+          <w:sz w:val="24"/>
+          <w:szCs w:val="24"/>
+        </w:rPr>
+        <w:t xml:space="preserve">additionally, 10 more Neurons </w:t>
+      </w:r>
+      <w:r>
+        <w:rPr>
+          <w:rFonts w:cstheme="minorHAnsi"/>
+          <w:sz w:val="24"/>
+          <w:szCs w:val="24"/>
+        </w:rPr>
+        <w:t>are visualized to capture more variety if neurons)</w:t>
+      </w:r>
+      <w:r>
+        <w:rPr>
+          <w:rFonts w:cstheme="minorHAnsi"/>
+          <w:sz w:val="24"/>
+          <w:szCs w:val="24"/>
         </w:rPr>
         <w:t>:</w:t>
       </w:r>
@@ -608,274 +800,7 @@
       <w:r>
         <w:rPr>
           <w:rFonts w:cstheme="minorHAnsi"/>
-          <w:sz w:val="24"/>
-          <w:szCs w:val="24"/>
-        </w:rPr>
-        <w:t>After</w:t>
-      </w:r>
-      <w:r>
-        <w:rPr>
-          <w:rFonts w:cstheme="minorHAnsi"/>
-          <w:sz w:val="24"/>
-          <w:szCs w:val="24"/>
-        </w:rPr>
-        <w:t xml:space="preserve"> the model </w:t>
-      </w:r>
-      <w:r>
-        <w:rPr>
-          <w:rFonts w:cstheme="minorHAnsi"/>
-          <w:sz w:val="24"/>
-          <w:szCs w:val="24"/>
-        </w:rPr>
-        <w:t>wa</w:t>
-      </w:r>
-      <w:r>
-        <w:rPr>
-          <w:rFonts w:cstheme="minorHAnsi"/>
-          <w:sz w:val="24"/>
-          <w:szCs w:val="24"/>
-        </w:rPr>
-        <w:t xml:space="preserve">s trained, and weights of first hidden layer </w:t>
-      </w:r>
-      <w:r>
-        <w:rPr>
-          <w:rFonts w:cstheme="minorHAnsi"/>
-          <w:sz w:val="24"/>
-          <w:szCs w:val="24"/>
-        </w:rPr>
-        <w:t>were extracted, the weights were</w:t>
-      </w:r>
-      <w:r>
-        <w:rPr>
-          <w:rFonts w:cstheme="minorHAnsi"/>
-          <w:sz w:val="24"/>
-          <w:szCs w:val="24"/>
-        </w:rPr>
-        <w:t xml:space="preserve"> of dimension 128x784, i.e., </w:t>
-      </w:r>
-      <w:r>
-        <w:rPr>
-          <w:rFonts w:cstheme="minorHAnsi"/>
-          <w:sz w:val="24"/>
-          <w:szCs w:val="24"/>
-        </w:rPr>
-        <w:t>the first hidden layer</w:t>
-      </w:r>
-      <w:r>
-        <w:rPr>
-          <w:rFonts w:cstheme="minorHAnsi"/>
-          <w:sz w:val="24"/>
-          <w:szCs w:val="24"/>
-        </w:rPr>
-        <w:t xml:space="preserve"> contain</w:t>
-      </w:r>
-      <w:r>
-        <w:rPr>
-          <w:rFonts w:cstheme="minorHAnsi"/>
-          <w:sz w:val="24"/>
-          <w:szCs w:val="24"/>
-        </w:rPr>
-        <w:t>s</w:t>
-      </w:r>
-      <w:r>
-        <w:rPr>
-          <w:rFonts w:cstheme="minorHAnsi"/>
-          <w:sz w:val="24"/>
-          <w:szCs w:val="24"/>
-        </w:rPr>
-        <w:t xml:space="preserve"> 128 neurons, each neuron is connected to 784 </w:t>
-      </w:r>
-      <w:r>
-        <w:rPr>
-          <w:rFonts w:cstheme="minorHAnsi"/>
-          <w:sz w:val="24"/>
-          <w:szCs w:val="24"/>
-        </w:rPr>
-        <w:t>input pixels.</w:t>
-      </w:r>
-    </w:p>
-    <w:p>
-      <w:pPr>
-        <w:rPr>
-          <w:rFonts w:cstheme="minorHAnsi"/>
-          <w:sz w:val="24"/>
-          <w:szCs w:val="24"/>
-        </w:rPr>
-      </w:pPr>
-      <w:r>
-        <w:rPr>
-          <w:rFonts w:cstheme="minorHAnsi"/>
-          <w:sz w:val="24"/>
-          <w:szCs w:val="24"/>
-        </w:rPr>
-        <w:t xml:space="preserve"> </w:t>
-      </w:r>
-      <w:r>
-        <w:rPr>
-          <w:rFonts w:cstheme="minorHAnsi"/>
-          <w:sz w:val="24"/>
-          <w:szCs w:val="24"/>
-        </w:rPr>
-        <w:t>A</w:t>
-      </w:r>
-      <w:r>
-        <w:rPr>
-          <w:rFonts w:cstheme="minorHAnsi"/>
-          <w:sz w:val="24"/>
-          <w:szCs w:val="24"/>
-        </w:rPr>
-        <w:t xml:space="preserve">ccording to our task, we have to </w:t>
-      </w:r>
-      <w:r>
-        <w:rPr>
-          <w:rFonts w:cstheme="minorHAnsi"/>
-          <w:sz w:val="24"/>
-          <w:szCs w:val="24"/>
-        </w:rPr>
-        <w:t>select</w:t>
-      </w:r>
-      <w:r>
-        <w:rPr>
-          <w:rFonts w:cstheme="minorHAnsi"/>
-          <w:sz w:val="24"/>
-          <w:szCs w:val="24"/>
-        </w:rPr>
-        <w:t xml:space="preserve"> 10 different neurons, and then reshape them back into 28x28 grids, </w:t>
-      </w:r>
-      <w:r>
-        <w:rPr>
-          <w:rFonts w:cstheme="minorHAnsi"/>
-          <w:sz w:val="24"/>
-          <w:szCs w:val="24"/>
-        </w:rPr>
-        <w:t>and plot them as heatmap</w:t>
-      </w:r>
-      <w:r>
-        <w:rPr>
-          <w:rFonts w:cstheme="minorHAnsi"/>
-          <w:sz w:val="24"/>
-          <w:szCs w:val="24"/>
-        </w:rPr>
-        <w:t>s</w:t>
-      </w:r>
-      <w:r>
-        <w:rPr>
-          <w:rFonts w:cstheme="minorHAnsi"/>
-          <w:sz w:val="24"/>
-          <w:szCs w:val="24"/>
-        </w:rPr>
-        <w:t>.</w:t>
-      </w:r>
-    </w:p>
-    <w:p>
-      <w:pPr>
-        <w:rPr>
-          <w:rFonts w:cstheme="minorHAnsi"/>
-          <w:sz w:val="24"/>
-          <w:szCs w:val="24"/>
-        </w:rPr>
-      </w:pPr>
-      <w:r>
-        <w:rPr>
-          <w:rFonts w:cstheme="minorHAnsi"/>
-          <w:sz w:val="24"/>
-          <w:szCs w:val="24"/>
-        </w:rPr>
-        <w:t>Positive weights</w:t>
-      </w:r>
-      <w:r>
-        <w:rPr>
-          <w:rFonts w:cstheme="minorHAnsi"/>
-          <w:sz w:val="24"/>
-          <w:szCs w:val="24"/>
-        </w:rPr>
-        <w:t xml:space="preserve"> will</w:t>
-      </w:r>
-      <w:r>
-        <w:rPr>
-          <w:rFonts w:cstheme="minorHAnsi"/>
-          <w:sz w:val="24"/>
-          <w:szCs w:val="24"/>
-        </w:rPr>
-        <w:t xml:space="preserve"> indicate regions of the image that excite the neuron, while negative weights suppress activation.</w:t>
-      </w:r>
-    </w:p>
-    <w:p>
-      <w:pPr>
-        <w:rPr>
-          <w:rFonts w:cstheme="minorHAnsi"/>
-          <w:sz w:val="24"/>
-          <w:szCs w:val="24"/>
-        </w:rPr>
-      </w:pPr>
-      <w:r>
-        <w:rPr>
-          <w:rFonts w:cstheme="minorHAnsi"/>
-          <w:sz w:val="24"/>
-          <w:szCs w:val="24"/>
-        </w:rPr>
-        <w:t xml:space="preserve">Here are the heatmaps of </w:t>
-      </w:r>
-      <w:r>
-        <w:rPr>
-          <w:rFonts w:cstheme="minorHAnsi"/>
-          <w:sz w:val="24"/>
-          <w:szCs w:val="24"/>
-        </w:rPr>
-        <w:t>1</w:t>
-      </w:r>
-      <w:r>
-        <w:rPr>
-          <w:rFonts w:cstheme="minorHAnsi"/>
-          <w:sz w:val="24"/>
-          <w:szCs w:val="24"/>
-        </w:rPr>
-        <w:t>0 neurons</w:t>
-      </w:r>
-      <w:r>
-        <w:rPr>
-          <w:rFonts w:cstheme="minorHAnsi"/>
-          <w:sz w:val="24"/>
-          <w:szCs w:val="24"/>
-        </w:rPr>
-        <w:t xml:space="preserve"> (</w:t>
-      </w:r>
-      <w:r>
-        <w:rPr>
-          <w:rFonts w:cstheme="minorHAnsi"/>
-          <w:sz w:val="24"/>
-          <w:szCs w:val="24"/>
-        </w:rPr>
-        <w:t xml:space="preserve">additionally, 10 more Neurons </w:t>
-      </w:r>
-      <w:r>
-        <w:rPr>
-          <w:rFonts w:cstheme="minorHAnsi"/>
-          <w:sz w:val="24"/>
-          <w:szCs w:val="24"/>
-        </w:rPr>
-        <w:t>are visualized to capture more variety if neurons)</w:t>
-      </w:r>
-      <w:r>
-        <w:rPr>
-          <w:rFonts w:cstheme="minorHAnsi"/>
-          <w:sz w:val="24"/>
-          <w:szCs w:val="24"/>
-        </w:rPr>
-        <w:t>:</w:t>
-      </w:r>
-    </w:p>
-    <w:p>
-      <w:pPr>
-        <w:rPr>
-          <w:rFonts w:cstheme="minorHAnsi"/>
-          <w:sz w:val="24"/>
-          <w:szCs w:val="24"/>
-        </w:rPr>
-      </w:pPr>
-      <w:r>
-        <w:rPr>
-          <w:rFonts w:cstheme="minorHAnsi"/>
+          <w:noProof/>
           <w:sz w:val="24"/>
           <w:szCs w:val="24"/>
         </w:rPr>
@@ -934,6 +859,7 @@
       <w:r>
         <w:rPr>
           <w:rFonts w:cstheme="minorHAnsi"/>
+          <w:noProof/>
           <w:sz w:val="24"/>
           <w:szCs w:val="24"/>
         </w:rPr>
@@ -1003,15 +929,7 @@
           <w:sz w:val="32"/>
           <w:szCs w:val="32"/>
         </w:rPr>
-        <w:t>Observations and Interpretatio</w:t>
-      </w:r>
-      <w:r>
-        <w:rPr>
-          <w:rFonts w:cstheme="minorHAnsi"/>
-          <w:sz w:val="32"/>
-          <w:szCs w:val="32"/>
-        </w:rPr>
-        <w:t>n:</w:t>
+        <w:t>Observations and Interpretation:</w:t>
       </w:r>
     </w:p>
     <w:p>
@@ -1090,25 +1008,7 @@
           <w:sz w:val="24"/>
           <w:szCs w:val="24"/>
         </w:rPr>
-        <w:t xml:space="preserve"> (for </w:t>
-      </w:r>
-      <w:proofErr w:type="spellStart"/>
-      <w:r>
-        <w:rPr>
-          <w:rFonts w:cstheme="minorHAnsi"/>
-          <w:sz w:val="24"/>
-          <w:szCs w:val="24"/>
-        </w:rPr>
-        <w:t>eg.</w:t>
-      </w:r>
-      <w:proofErr w:type="spellEnd"/>
-      <w:r>
-        <w:rPr>
-          <w:rFonts w:cstheme="minorHAnsi"/>
-          <w:sz w:val="24"/>
-          <w:szCs w:val="24"/>
-        </w:rPr>
-        <w:t xml:space="preserve"> Neuron </w:t>
+        <w:t xml:space="preserve"> (for eg. Neuron </w:t>
       </w:r>
       <w:r>
         <w:rPr>
@@ -1210,25 +1110,7 @@
           <w:sz w:val="24"/>
           <w:szCs w:val="24"/>
         </w:rPr>
-        <w:t xml:space="preserve">giving positive on multiple specific regions, while also giving negative weights to multiple specific regions (for </w:t>
-      </w:r>
-      <w:proofErr w:type="spellStart"/>
-      <w:r>
-        <w:rPr>
-          <w:rFonts w:cstheme="minorHAnsi"/>
-          <w:sz w:val="24"/>
-          <w:szCs w:val="24"/>
-        </w:rPr>
-        <w:t>eg.</w:t>
-      </w:r>
-      <w:proofErr w:type="spellEnd"/>
-      <w:r>
-        <w:rPr>
-          <w:rFonts w:cstheme="minorHAnsi"/>
-          <w:sz w:val="24"/>
-          <w:szCs w:val="24"/>
-        </w:rPr>
-        <w:t xml:space="preserve"> Neuron 11, 18)</w:t>
+        <w:t>giving positive on multiple specific regions, while also giving negative weights to multiple specific regions (for eg. Neuron 11, 18)</w:t>
       </w:r>
       <w:r>
         <w:rPr>
@@ -1282,25 +1164,7 @@
           <w:sz w:val="24"/>
           <w:szCs w:val="24"/>
         </w:rPr>
-        <w:t xml:space="preserve">noise (for </w:t>
-      </w:r>
-      <w:proofErr w:type="spellStart"/>
-      <w:r>
-        <w:rPr>
-          <w:rFonts w:cstheme="minorHAnsi"/>
-          <w:sz w:val="24"/>
-          <w:szCs w:val="24"/>
-        </w:rPr>
-        <w:t>eg.</w:t>
-      </w:r>
-      <w:proofErr w:type="spellEnd"/>
-      <w:r>
-        <w:rPr>
-          <w:rFonts w:cstheme="minorHAnsi"/>
-          <w:sz w:val="24"/>
-          <w:szCs w:val="24"/>
-        </w:rPr>
-        <w:t xml:space="preserve"> Neuron 5, 6, 7)</w:t>
+        <w:t>noise (for eg. Neuron 5, 6, 7)</w:t>
       </w:r>
       <w:r>
         <w:rPr>
@@ -1351,6 +1215,60 @@
     </w:p>
     <w:p>
       <w:pPr>
+        <w:pStyle w:val="ListParagraph"/>
+        <w:numPr>
+          <w:ilvl w:val="0"/>
+          <w:numId w:val="2"/>
+        </w:numPr>
+        <w:rPr>
+          <w:rFonts w:cstheme="minorHAnsi"/>
+          <w:sz w:val="24"/>
+          <w:szCs w:val="24"/>
+        </w:rPr>
+      </w:pPr>
+      <w:r>
+        <w:rPr>
+          <w:rFonts w:cstheme="minorHAnsi"/>
+          <w:sz w:val="24"/>
+          <w:szCs w:val="24"/>
+        </w:rPr>
+        <w:t>We</w:t>
+      </w:r>
+      <w:r>
+        <w:rPr>
+          <w:rFonts w:cstheme="minorHAnsi"/>
+          <w:sz w:val="24"/>
+          <w:szCs w:val="24"/>
+        </w:rPr>
+        <w:t xml:space="preserve"> observed that neurons with visually meaningful patterns have weights with larger magnitudes, whereas neurons that appear noisy have lower</w:t>
+      </w:r>
+      <w:r>
+        <w:rPr>
+          <w:rFonts w:cstheme="minorHAnsi"/>
+          <w:sz w:val="24"/>
+          <w:szCs w:val="24"/>
+        </w:rPr>
+        <w:t xml:space="preserve"> </w:t>
+      </w:r>
+      <w:r>
+        <w:rPr>
+          <w:rFonts w:cstheme="minorHAnsi"/>
+          <w:sz w:val="24"/>
+          <w:szCs w:val="24"/>
+        </w:rPr>
+        <w:t>magnitude weights. This suggests that the structured neurons contribute more to the network’s activations and final predictions, while noisy neurons are weakly utilized</w:t>
+      </w:r>
+      <w:r>
+        <w:rPr>
+          <w:rFonts w:cstheme="minorHAnsi"/>
+          <w:sz w:val="24"/>
+          <w:szCs w:val="24"/>
+        </w:rPr>
+        <w:t>.</w:t>
+      </w:r>
+    </w:p>
+    <w:p>
+      <w:pPr>
         <w:rPr>
           <w:rFonts w:cstheme="minorHAnsi"/>
           <w:sz w:val="24"/>
@@ -1427,7 +1345,16 @@
           <w:sz w:val="24"/>
           <w:szCs w:val="24"/>
         </w:rPr>
-        <w:t xml:space="preserve"> but not directly resembling any digit, whereas some resembles some of the digits present in MNIST, while other a</w:t>
+        <w:t xml:space="preserve"> but not directly resembling any digit, whereas some resembles </w:t>
+      </w:r>
+      <w:r>
+        <w:rPr>
+          <w:rFonts w:cstheme="minorHAnsi"/>
+          <w:sz w:val="24"/>
+          <w:szCs w:val="24"/>
+        </w:rPr>
+        <w:lastRenderedPageBreak/>
+        <w:t>some of the digits present in MNIST, while other a</w:t>
       </w:r>
       <w:r>
         <w:rPr>
@@ -1476,55 +1403,7 @@
           <w:sz w:val="24"/>
           <w:szCs w:val="24"/>
         </w:rPr>
-        <w:t xml:space="preserve">Overall, the visualization shows that the FCNN learns a </w:t>
-      </w:r>
-      <w:r>
-        <w:rPr>
-          <w:rFonts w:cstheme="minorHAnsi"/>
-          <w:sz w:val="24"/>
-          <w:szCs w:val="24"/>
-        </w:rPr>
-        <w:t>diverse set</w:t>
-      </w:r>
-      <w:r>
-        <w:rPr>
-          <w:rFonts w:cstheme="minorHAnsi"/>
-          <w:sz w:val="24"/>
-          <w:szCs w:val="24"/>
-        </w:rPr>
-        <w:t xml:space="preserve"> of features, ranging from basic </w:t>
-      </w:r>
-      <w:r>
-        <w:rPr>
-          <w:rFonts w:cstheme="minorHAnsi"/>
-          <w:sz w:val="24"/>
-          <w:szCs w:val="24"/>
-        </w:rPr>
-        <w:t>lines</w:t>
-      </w:r>
-      <w:r>
-        <w:rPr>
-          <w:rFonts w:cstheme="minorHAnsi"/>
-          <w:sz w:val="24"/>
-          <w:szCs w:val="24"/>
-        </w:rPr>
-        <w:t xml:space="preserve"> to more complex digit-like patterns</w:t>
-      </w:r>
-      <w:r>
-        <w:rPr>
-          <w:rFonts w:cstheme="minorHAnsi"/>
-          <w:sz w:val="24"/>
-          <w:szCs w:val="24"/>
-        </w:rPr>
-        <w:t xml:space="preserve"> to fine-grained noise</w:t>
-      </w:r>
-      <w:r>
-        <w:rPr>
-          <w:rFonts w:cstheme="minorHAnsi"/>
-          <w:sz w:val="24"/>
-          <w:szCs w:val="24"/>
-        </w:rPr>
-        <w:t>, forming a meaningful latent representation of the input data.</w:t>
+        <w:t>Overall, the visualization shows that the FCNN learns a diverse set of features, ranging from basic lines to more complex digit-like patterns to fine-grained noise, forming a meaningful latent representation of the input data.</w:t>
       </w:r>
     </w:p>
     <w:sectPr>

</xml_diff>